<commit_message>
Enhance Nyx visualization submission
</commit_message>
<xml_diff>
--- a/report/Answer_Sheet.docx
+++ b/report/Answer_Sheet.docx
@@ -246,6 +246,294 @@
                 <w:sz w:val="18"/>
               </w:rPr>
               <w:t>体绘制、时序热力图、结构指标仪表盘、相空间交互刷选、演示视频</w:t>
+            </w:r>
+          </w:p>
+        </w:tc>
+      </w:tr>
+    </w:tbl>
+    <w:p>
+      <w:pPr>
+        <w:pStyle w:val="Heading1"/>
+      </w:pPr>
+      <w:r>
+        <w:t>任务覆盖说明</w:t>
+      </w:r>
+    </w:p>
+    <w:tbl>
+      <w:tblPr>
+        <w:tblStyle w:val="TableGrid"/>
+        <w:tblW w:type="auto" w:w="0"/>
+        <w:tblLook w:firstColumn="1" w:firstRow="1" w:lastColumn="0" w:lastRow="0" w:noHBand="0" w:noVBand="1" w:val="04A0"/>
+      </w:tblPr>
+      <w:tblGrid>
+        <w:gridCol w:w="3264"/>
+        <w:gridCol w:w="3264"/>
+        <w:gridCol w:w="3264"/>
+      </w:tblGrid>
+      <w:tr>
+        <w:tc>
+          <w:tcPr>
+            <w:tcW w:type="dxa" w:w="3264"/>
+          </w:tcPr>
+          <w:p>
+            <w:pPr>
+              <w:jc w:val="center"/>
+            </w:pPr>
+            <w:r>
+              <w:rPr>
+                <w:rFonts w:ascii="Microsoft YaHei" w:hAnsi="Microsoft YaHei" w:eastAsia="Microsoft YaHei"/>
+                <w:b/>
+                <w:sz w:val="18"/>
+              </w:rPr>
+              <w:t>任务要求</w:t>
+            </w:r>
+          </w:p>
+        </w:tc>
+        <w:tc>
+          <w:tcPr>
+            <w:tcW w:type="dxa" w:w="3264"/>
+          </w:tcPr>
+          <w:p>
+            <w:pPr>
+              <w:jc w:val="center"/>
+            </w:pPr>
+            <w:r>
+              <w:rPr>
+                <w:rFonts w:ascii="Microsoft YaHei" w:hAnsi="Microsoft YaHei" w:eastAsia="Microsoft YaHei"/>
+                <w:b/>
+                <w:sz w:val="18"/>
+              </w:rPr>
+              <w:t>对应成果</w:t>
+            </w:r>
+          </w:p>
+        </w:tc>
+        <w:tc>
+          <w:tcPr>
+            <w:tcW w:type="dxa" w:w="3264"/>
+          </w:tcPr>
+          <w:p>
+            <w:pPr>
+              <w:jc w:val="center"/>
+            </w:pPr>
+            <w:r>
+              <w:rPr>
+                <w:rFonts w:ascii="Microsoft YaHei" w:hAnsi="Microsoft YaHei" w:eastAsia="Microsoft YaHei"/>
+                <w:b/>
+                <w:sz w:val="18"/>
+              </w:rPr>
+              <w:t>核心文件</w:t>
+            </w:r>
+          </w:p>
+        </w:tc>
+      </w:tr>
+      <w:tr>
+        <w:tc>
+          <w:tcPr>
+            <w:tcW w:type="dxa" w:w="3264"/>
+          </w:tcPr>
+          <w:p>
+            <w:pPr>
+              <w:jc w:val="left"/>
+            </w:pPr>
+            <w:r>
+              <w:rPr>
+                <w:rFonts w:ascii="Microsoft YaHei" w:hAnsi="Microsoft YaHei" w:eastAsia="Microsoft YaHei"/>
+                <w:sz w:val="18"/>
+              </w:rPr>
+              <w:t>体数据渲染、传递函数与光照</w:t>
+            </w:r>
+          </w:p>
+        </w:tc>
+        <w:tc>
+          <w:tcPr>
+            <w:tcW w:type="dxa" w:w="3264"/>
+          </w:tcPr>
+          <w:p>
+            <w:pPr>
+              <w:jc w:val="left"/>
+            </w:pPr>
+            <w:r>
+              <w:rPr>
+                <w:rFonts w:ascii="Microsoft YaHei" w:hAnsi="Microsoft YaHei" w:eastAsia="Microsoft YaHei"/>
+                <w:sz w:val="18"/>
+              </w:rPr>
+              <w:t>报告第 4 节；体绘制图、传递函数设计图</w:t>
+            </w:r>
+          </w:p>
+        </w:tc>
+        <w:tc>
+          <w:tcPr>
+            <w:tcW w:type="dxa" w:w="3264"/>
+          </w:tcPr>
+          <w:p>
+            <w:pPr>
+              <w:jc w:val="left"/>
+            </w:pPr>
+            <w:r>
+              <w:rPr>
+                <w:rFonts w:ascii="Microsoft YaHei" w:hAnsi="Microsoft YaHei" w:eastAsia="Microsoft YaHei"/>
+                <w:sz w:val="18"/>
+              </w:rPr>
+              <w:t>code/step4_volume_render.m；results/02_volume_render；results/07_visual_story/transfer_function_design.png</w:t>
+            </w:r>
+          </w:p>
+        </w:tc>
+      </w:tr>
+      <w:tr>
+        <w:tc>
+          <w:tcPr>
+            <w:tcW w:type="dxa" w:w="3264"/>
+          </w:tcPr>
+          <w:p>
+            <w:pPr>
+              <w:jc w:val="left"/>
+            </w:pPr>
+            <w:r>
+              <w:rPr>
+                <w:rFonts w:ascii="Microsoft YaHei" w:hAnsi="Microsoft YaHei" w:eastAsia="Microsoft YaHei"/>
+                <w:sz w:val="18"/>
+              </w:rPr>
+              <w:t>宇宙密度演化特征归纳</w:t>
+            </w:r>
+          </w:p>
+        </w:tc>
+        <w:tc>
+          <w:tcPr>
+            <w:tcW w:type="dxa" w:w="3264"/>
+          </w:tcPr>
+          <w:p>
+            <w:pPr>
+              <w:jc w:val="left"/>
+            </w:pPr>
+            <w:r>
+              <w:rPr>
+                <w:rFonts w:ascii="Microsoft YaHei" w:hAnsi="Microsoft YaHei" w:eastAsia="Microsoft YaHei"/>
+                <w:sz w:val="18"/>
+              </w:rPr>
+              <w:t>报告第 5、9 节；宇宙网演化图谱</w:t>
+            </w:r>
+          </w:p>
+        </w:tc>
+        <w:tc>
+          <w:tcPr>
+            <w:tcW w:type="dxa" w:w="3264"/>
+          </w:tcPr>
+          <w:p>
+            <w:pPr>
+              <w:jc w:val="left"/>
+            </w:pPr>
+            <w:r>
+              <w:rPr>
+                <w:rFonts w:ascii="Microsoft YaHei" w:hAnsi="Microsoft YaHei" w:eastAsia="Microsoft YaHei"/>
+                <w:sz w:val="18"/>
+              </w:rPr>
+              <w:t>results/07_visual_story/cosmic_web_atlas.png；video/demo.mp4</w:t>
+            </w:r>
+          </w:p>
+        </w:tc>
+      </w:tr>
+      <w:tr>
+        <w:tc>
+          <w:tcPr>
+            <w:tcW w:type="dxa" w:w="3264"/>
+          </w:tcPr>
+          <w:p>
+            <w:pPr>
+              <w:jc w:val="left"/>
+            </w:pPr>
+            <w:r>
+              <w:rPr>
+                <w:rFonts w:ascii="Microsoft YaHei" w:hAnsi="Microsoft YaHei" w:eastAsia="Microsoft YaHei"/>
+                <w:sz w:val="18"/>
+              </w:rPr>
+              <w:t>100 步密度统计与对数直方图</w:t>
+            </w:r>
+          </w:p>
+        </w:tc>
+        <w:tc>
+          <w:tcPr>
+            <w:tcW w:type="dxa" w:w="3264"/>
+          </w:tcPr>
+          <w:p>
+            <w:pPr>
+              <w:jc w:val="left"/>
+            </w:pPr>
+            <w:r>
+              <w:rPr>
+                <w:rFonts w:ascii="Microsoft YaHei" w:hAnsi="Microsoft YaHei" w:eastAsia="Microsoft YaHei"/>
+                <w:sz w:val="18"/>
+              </w:rPr>
+              <w:t>报告第 6 节；统计曲线、直方图热力图</w:t>
+            </w:r>
+          </w:p>
+        </w:tc>
+        <w:tc>
+          <w:tcPr>
+            <w:tcW w:type="dxa" w:w="3264"/>
+          </w:tcPr>
+          <w:p>
+            <w:pPr>
+              <w:jc w:val="left"/>
+            </w:pPr>
+            <w:r>
+              <w:rPr>
+                <w:rFonts w:ascii="Microsoft YaHei" w:hAnsi="Microsoft YaHei" w:eastAsia="Microsoft YaHei"/>
+                <w:sz w:val="18"/>
+              </w:rPr>
+              <w:t>code/step2_density_statistics.m；code/step3_draw_histograms.m；data/processed/density_stats.csv</w:t>
+            </w:r>
+          </w:p>
+        </w:tc>
+      </w:tr>
+      <w:tr>
+        <w:tc>
+          <w:tcPr>
+            <w:tcW w:type="dxa" w:w="3264"/>
+          </w:tcPr>
+          <w:p>
+            <w:pPr>
+              <w:jc w:val="left"/>
+            </w:pPr>
+            <w:r>
+              <w:rPr>
+                <w:rFonts w:ascii="Microsoft YaHei" w:hAnsi="Microsoft YaHei" w:eastAsia="Microsoft YaHei"/>
+                <w:sz w:val="18"/>
+              </w:rPr>
+              <w:t>相空间交互刷选联动分析</w:t>
+            </w:r>
+          </w:p>
+        </w:tc>
+        <w:tc>
+          <w:tcPr>
+            <w:tcW w:type="dxa" w:w="3264"/>
+          </w:tcPr>
+          <w:p>
+            <w:pPr>
+              <w:jc w:val="left"/>
+            </w:pPr>
+            <w:r>
+              <w:rPr>
+                <w:rFonts w:ascii="Microsoft YaHei" w:hAnsi="Microsoft YaHei" w:eastAsia="Microsoft YaHei"/>
+                <w:sz w:val="18"/>
+              </w:rPr>
+              <w:t>报告第 7 节；前 1% 高密度刷选结果和交互故事板</w:t>
+            </w:r>
+          </w:p>
+        </w:tc>
+        <w:tc>
+          <w:tcPr>
+            <w:tcW w:type="dxa" w:w="3264"/>
+          </w:tcPr>
+          <w:p>
+            <w:pPr>
+              <w:jc w:val="left"/>
+            </w:pPr>
+            <w:r>
+              <w:rPr>
+                <w:rFonts w:ascii="Microsoft YaHei" w:hAnsi="Microsoft YaHei" w:eastAsia="Microsoft YaHei"/>
+                <w:sz w:val="18"/>
+              </w:rPr>
+              <w:t>code/interactive_dashboard.m；code/step5_high_density_selection.m；results/05_interaction_selection</w:t>
             </w:r>
           </w:p>
         </w:tc>

</xml_diff>

<commit_message>
Add representative image to submission
</commit_message>
<xml_diff>
--- a/report/Answer_Sheet.docx
+++ b/report/Answer_Sheet.docx
@@ -245,7 +245,7 @@
                 <w:rFonts w:ascii="Microsoft YaHei" w:hAnsi="Microsoft YaHei" w:eastAsia="Microsoft YaHei"/>
                 <w:sz w:val="18"/>
               </w:rPr>
-              <w:t>体绘制、时序热力图、结构指标仪表盘、相空间交互刷选、演示视频</w:t>
+              <w:t>体绘制、时序热力图、结构指标仪表盘、相空间交互刷选、代表图、演示视频</w:t>
             </w:r>
           </w:p>
         </w:tc>
@@ -584,6 +584,14 @@
         <w:pStyle w:val="ListBullet"/>
       </w:pPr>
       <w:r>
+        <w:t>results/representative_image.jpg：官方要求的 JPG 代表图。</w:t>
+      </w:r>
+    </w:p>
+    <w:p>
+      <w:pPr>
+        <w:pStyle w:val="ListBullet"/>
+      </w:pPr>
+      <w:r>
         <w:t>video：demo.mp4 演示视频。</w:t>
       </w:r>
     </w:p>

</xml_diff>